<commit_message>
Fill team name and test count in execution evidence; refresh START_HERE sign-in step
Co-Authored-By: Claude Opus 5.5 <noreply@anthropic.com>
</commit_message>
<xml_diff>
--- a/submission/Habilin-Execution-Evidence.docx
+++ b/submission/Habilin-Execution-Evidence.docx
@@ -80,7 +80,7 @@
               <w:rPr>
                 <w:color w:val="172B36"/>
               </w:rPr>
-              <w:t xml:space="preserve">TEAM NAME TO COMPLETE</w:t>
+              <w:t xml:space="preserve">Team Caelus</w:t>
             </w:r>
           </w:p>
         </w:tc>
@@ -200,7 +200,7 @@
         <w:rPr>
           <w:color w:val="172B36"/>
         </w:rPr>
-        <w:t xml:space="preserve">The automated browser run with live Jev classification on 2026-10-19T19:51:33.030Z used actual Jev/TypeSafe intent classification, durable SQLite state and checked tools. The issuer correction and recovery were executed by the app. The browser script simulated professional and owner actors using separate authenticated sessions and the separate local owner-code command. The simulated ledger advances to settled when checked; no independent settlement feed is claimed. 33 automated tests passed separately, including direct HTTP/tool bypasses. This is local synthetic execution evidence, not proof of actual BIR/bank/registry access, legal effectiveness, deployment, customer adoption or advantage over a general agent.</w:t>
+        <w:t xml:space="preserve">The automated browser run with live Jev classification on 2026-10-19T19:51:33.030Z used actual Jev/TypeSafe intent classification, durable SQLite state and checked tools. The issuer correction and recovery were executed by the app. The browser script simulated professional and owner actors using separate authenticated sessions and the separate local owner-code command. The simulated ledger advances to settled when checked; no independent settlement feed is claimed. 70 automated tests passed separately, including direct HTTP/tool bypasses. This is local synthetic execution evidence, not proof of actual BIR/bank/registry access, legal effectiveness, deployment, customer adoption or advantage over a general agent.</w:t>
       </w:r>
     </w:p>
     <w:p>

</xml_diff>